<commit_message>
Add base map in the readme file
</commit_message>
<xml_diff>
--- a/04_Docs/Resultads_AirPollution_PO_Suplementary_17032026.docx
+++ b/04_Docs/Resultads_AirPollution_PO_Suplementary_17032026.docx
@@ -11704,23 +11704,7 @@
           <w:sz w:val="22"/>
           <w:szCs w:val="22"/>
         </w:rPr>
-        <w:t xml:space="preserve"> </w:t>
-      </w:r>
-      <w:proofErr w:type="spellStart"/>
-      <w:r>
-        <w:rPr>
-          <w:sz w:val="22"/>
-          <w:szCs w:val="22"/>
-        </w:rPr>
-        <w:t>for</w:t>
-      </w:r>
-      <w:proofErr w:type="spellEnd"/>
-      <w:r>
-        <w:rPr>
-          <w:sz w:val="22"/>
-          <w:szCs w:val="22"/>
-        </w:rPr>
-        <w:t xml:space="preserve"> </w:t>
+        <w:t xml:space="preserve"> for </w:t>
       </w:r>
       <w:proofErr w:type="spellStart"/>
       <w:r>
@@ -11793,7 +11777,7 @@
           <w14:ligatures w14:val="standardContextual"/>
         </w:rPr>
         <w:drawing>
-          <wp:inline distT="0" distB="0" distL="0" distR="0" wp14:anchorId="0B1B1BCB" wp14:editId="1E517366">
+          <wp:inline distT="0" distB="0" distL="0" distR="0" wp14:anchorId="0B1B1BCB" wp14:editId="18EE03FC">
             <wp:extent cx="9144000" cy="3657600"/>
             <wp:effectExtent l="0" t="0" r="0" b="0"/>
             <wp:docPr id="861528112" name="Imagen 3"/>
@@ -50626,7 +50610,7 @@
         </w:rPr>
         <w:lastRenderedPageBreak/>
         <w:drawing>
-          <wp:inline distT="0" distB="0" distL="0" distR="0" wp14:anchorId="3CC879A5" wp14:editId="583E0BC5">
+          <wp:inline distT="0" distB="0" distL="0" distR="0" wp14:anchorId="3CC879A5" wp14:editId="0F6B0D68">
             <wp:extent cx="5708015" cy="6858000"/>
             <wp:effectExtent l="0" t="0" r="0" b="0"/>
             <wp:docPr id="374536648" name="Imagen 4"/>
@@ -50676,7 +50660,7 @@
         </w:rPr>
         <w:lastRenderedPageBreak/>
         <w:drawing>
-          <wp:inline distT="0" distB="0" distL="0" distR="0" wp14:anchorId="529737C6" wp14:editId="348B1F57">
+          <wp:inline distT="0" distB="0" distL="0" distR="0" wp14:anchorId="529737C6" wp14:editId="53DAE409">
             <wp:extent cx="5708015" cy="6858000"/>
             <wp:effectExtent l="0" t="0" r="0" b="0"/>
             <wp:docPr id="2104180400" name="Imagen 5"/>

</xml_diff>

<commit_message>
Add DEIS data TEM, PLC, 2009 - 2016
</commit_message>
<xml_diff>
--- a/04_Docs/Resultads_AirPollution_PO_Suplementary_17032026.docx
+++ b/04_Docs/Resultads_AirPollution_PO_Suplementary_17032026.docx
@@ -11777,7 +11777,7 @@
           <w14:ligatures w14:val="standardContextual"/>
         </w:rPr>
         <w:drawing>
-          <wp:inline distT="0" distB="0" distL="0" distR="0" wp14:anchorId="0B1B1BCB" wp14:editId="18EE03FC">
+          <wp:inline distT="0" distB="0" distL="0" distR="0" wp14:anchorId="0B1B1BCB" wp14:editId="2DF9406A">
             <wp:extent cx="9144000" cy="3657600"/>
             <wp:effectExtent l="0" t="0" r="0" b="0"/>
             <wp:docPr id="861528112" name="Imagen 3"/>
@@ -50610,7 +50610,7 @@
         </w:rPr>
         <w:lastRenderedPageBreak/>
         <w:drawing>
-          <wp:inline distT="0" distB="0" distL="0" distR="0" wp14:anchorId="3CC879A5" wp14:editId="0F6B0D68">
+          <wp:inline distT="0" distB="0" distL="0" distR="0" wp14:anchorId="3CC879A5" wp14:editId="773B0344">
             <wp:extent cx="5708015" cy="6858000"/>
             <wp:effectExtent l="0" t="0" r="0" b="0"/>
             <wp:docPr id="374536648" name="Imagen 4"/>
@@ -50660,7 +50660,7 @@
         </w:rPr>
         <w:lastRenderedPageBreak/>
         <w:drawing>
-          <wp:inline distT="0" distB="0" distL="0" distR="0" wp14:anchorId="529737C6" wp14:editId="53DAE409">
+          <wp:inline distT="0" distB="0" distL="0" distR="0" wp14:anchorId="529737C6" wp14:editId="621914AC">
             <wp:extent cx="5708015" cy="6858000"/>
             <wp:effectExtent l="0" t="0" r="0" b="0"/>
             <wp:docPr id="2104180400" name="Imagen 5"/>

</xml_diff>